<commit_message>
Replace the regenerated Azerbaijani illustrations and restore local story editing so titles open the zoom view and show the saved file name.
Co-authored-by: Cursor <cursoragent@cursor.com>
</commit_message>
<xml_diff>
--- a/ky/wisdom-stories/dervishs-robe.docx
+++ b/ky/wisdom-stories/dervishs-robe.docx
@@ -165,7 +165,7 @@
           <w:sz w:val="22"/>
           <w:lang w:val="ky-KG"/>
         </w:rPr>
-        <w:t>— Аны дербиштин кейпинде көргөнүм үчүн качкан жокмун. Мергенчи болгондо, дароо учуп кетмекмин. Бирок «дербиштен зыян келбейт, алар Кудайдан коркот» деп ойлодум.</w:t>
+        <w:t>— Падышам, мен аны дербиштин кейпинде көргөнүм үчүн качкан жокмун. Мергенчи болгондо, дароо учуп кетмекмин. Бирок «дербиштен зыян келбейт, алар Кудайдан коркот» деп ойлодум.</w:t>
       </w:r>
     </w:p>
     <w:p>
@@ -297,7 +297,7 @@
           <w:sz w:val="22"/>
           <w:lang w:val="ky-KG"/>
         </w:rPr>
-        <w:t xml:space="preserve">Сабак: </w:t>
+        <w:t>Сабак: Чапан кийгендин баары эле дербиш эмес. Адамдын ким экенин сырткы кейпинен эмес, кылган ишинен тааны.</w:t>
       </w:r>
       <w:r>
         <w:rPr>
@@ -306,7 +306,6 @@
           <w:sz w:val="22"/>
           <w:lang w:val="ky-KG"/>
         </w:rPr>
-        <w:t>Чапан кийгендин баары эле дербиш эмес. Адамдын ким экенин сырткы кейпинен эмес, кылган ишинен тааны.</w:t>
       </w:r>
     </w:p>
     <w:p>

</xml_diff>